<commit_message>
Fix photo placement, duplicate folders, disable button during queue
Fix 1 - Photo placement per template:
- Templates 1 & 4: photo on rId4 (image1.jpeg)
- Templates 2 & 3: photo on rId5 (image2.jpeg), rId4 is card background
- insertPhoto now takes templatePath to determine correct rId
- Removed incorrect square resize (templates 2 & 3 already square at rId5)

Fix 2 - Duplicate Drive folders:
- Race condition: Promise.all on parallel uploads caused getOrCreateFolder
  to be called concurrently, both seeing cache miss, both creating folders
- Fix: sequential uploads in uploadQueue.js
- Added folderLocks in googleDrive.js so concurrent callers await same Promise

Fix 3 - Disable submit button during queue:
- showQueueBar disables submit button
- hideQueueBar re-enables it
- User cannot click generate while in queue
</commit_message>
<xml_diff>
--- a/templates/idtemp2.docx
+++ b/templates/idtemp2.docx
@@ -7,259 +7,18 @@
         <w:rPr>
           <w:noProof/>
         </w:rPr>
-        <mc:AlternateContent>
-          <mc:Choice Requires="wps">
-            <w:drawing>
-              <wp:anchor distT="0" distB="0" distL="114300" distR="114300" simplePos="0" relativeHeight="251688960" behindDoc="0" locked="0" layoutInCell="1" allowOverlap="1" wp14:anchorId="71AA8ABC" wp14:editId="47F341F9">
-                <wp:simplePos x="0" y="0"/>
-                <wp:positionH relativeFrom="page">
-                  <wp:posOffset>5512006</wp:posOffset>
-                </wp:positionH>
-                <wp:positionV relativeFrom="paragraph">
-                  <wp:posOffset>-3175</wp:posOffset>
-                </wp:positionV>
-                <wp:extent cx="5082705" cy="3211189"/>
-                <wp:effectExtent l="133350" t="133350" r="156210" b="161290"/>
-                <wp:wrapNone/>
-                <wp:docPr id="17" name="Rectangle 17"/>
-                <wp:cNvGraphicFramePr/>
-                <a:graphic xmlns:a="http://schemas.openxmlformats.org/drawingml/2006/main">
-                  <a:graphicData uri="http://schemas.microsoft.com/office/word/2010/wordprocessingShape">
-                    <wps:wsp>
-                      <wps:cNvSpPr/>
-                      <wps:spPr>
-                        <a:xfrm>
-                          <a:off x="0" y="0"/>
-                          <a:ext cx="5082705" cy="3211189"/>
-                        </a:xfrm>
-                        <a:prstGeom prst="rect">
-                          <a:avLst/>
-                        </a:prstGeom>
-                        <a:noFill/>
-                        <a:ln w="282575">
-                          <a:solidFill>
-                            <a:srgbClr val="7E2100"/>
-                          </a:solidFill>
-                        </a:ln>
-                      </wps:spPr>
-                      <wps:style>
-                        <a:lnRef idx="2">
-                          <a:schemeClr val="accent1">
-                            <a:shade val="50000"/>
-                          </a:schemeClr>
-                        </a:lnRef>
-                        <a:fillRef idx="1">
-                          <a:schemeClr val="accent1"/>
-                        </a:fillRef>
-                        <a:effectRef idx="0">
-                          <a:schemeClr val="accent1"/>
-                        </a:effectRef>
-                        <a:fontRef idx="minor">
-                          <a:schemeClr val="lt1"/>
-                        </a:fontRef>
-                      </wps:style>
-                      <wps:bodyPr rot="0" spcFirstLastPara="0" vertOverflow="overflow" horzOverflow="overflow" vert="horz" wrap="square" lIns="91440" tIns="45720" rIns="91440" bIns="45720" numCol="1" spcCol="0" rtlCol="0" fromWordArt="0" anchor="ctr" anchorCtr="0" forceAA="0" compatLnSpc="1">
-                        <a:prstTxWarp prst="textNoShape">
-                          <a:avLst/>
-                        </a:prstTxWarp>
-                        <a:noAutofit/>
-                      </wps:bodyPr>
-                    </wps:wsp>
-                  </a:graphicData>
-                </a:graphic>
-                <wp14:sizeRelH relativeFrom="margin">
-                  <wp14:pctWidth>0</wp14:pctWidth>
-                </wp14:sizeRelH>
-                <wp14:sizeRelV relativeFrom="margin">
-                  <wp14:pctHeight>0</wp14:pctHeight>
-                </wp14:sizeRelV>
-              </wp:anchor>
-            </w:drawing>
-          </mc:Choice>
-          <mc:Fallback>
-            <w:pict>
-              <v:rect w14:anchorId="1012C619" id="Rectangle 17" o:spid="_x0000_s1026" style="position:absolute;margin-left:434pt;margin-top:-.25pt;width:400.2pt;height:252.85pt;z-index:251688960;visibility:visible;mso-wrap-style:square;mso-width-percent:0;mso-height-percent:0;mso-wrap-distance-left:9pt;mso-wrap-distance-top:0;mso-wrap-distance-right:9pt;mso-wrap-distance-bottom:0;mso-position-horizontal:absolute;mso-position-horizontal-relative:page;mso-position-vertical:absolute;mso-position-vertical-relative:text;mso-width-percent:0;mso-height-percent:0;mso-width-relative:margin;mso-height-relative:margin;v-text-anchor:middle" o:gfxdata="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" filled="f" strokecolor="#7e2100" strokeweight="22.25pt">
-                <w10:wrap anchorx="page"/>
-              </v:rect>
-            </w:pict>
-          </mc:Fallback>
-        </mc:AlternateContent>
-      </w:r>
-      <w:r>
-        <w:rPr>
-          <w:noProof/>
-        </w:rPr>
-        <mc:AlternateContent>
-          <mc:Choice Requires="wps">
-            <w:drawing>
-              <wp:anchor distT="0" distB="0" distL="114300" distR="114300" simplePos="0" relativeHeight="251686912" behindDoc="0" locked="0" layoutInCell="1" allowOverlap="1" wp14:anchorId="6ED560BA" wp14:editId="393E5AEA">
-                <wp:simplePos x="0" y="0"/>
-                <wp:positionH relativeFrom="column">
-                  <wp:posOffset>-844424</wp:posOffset>
-                </wp:positionH>
-                <wp:positionV relativeFrom="paragraph">
-                  <wp:posOffset>-8029</wp:posOffset>
-                </wp:positionV>
-                <wp:extent cx="5082705" cy="3211189"/>
-                <wp:effectExtent l="133350" t="133350" r="156210" b="161290"/>
-                <wp:wrapNone/>
-                <wp:docPr id="13" name="Rectangle 13"/>
-                <wp:cNvGraphicFramePr/>
-                <a:graphic xmlns:a="http://schemas.openxmlformats.org/drawingml/2006/main">
-                  <a:graphicData uri="http://schemas.microsoft.com/office/word/2010/wordprocessingShape">
-                    <wps:wsp>
-                      <wps:cNvSpPr/>
-                      <wps:spPr>
-                        <a:xfrm>
-                          <a:off x="0" y="0"/>
-                          <a:ext cx="5082705" cy="3211189"/>
-                        </a:xfrm>
-                        <a:prstGeom prst="rect">
-                          <a:avLst/>
-                        </a:prstGeom>
-                        <a:noFill/>
-                        <a:ln w="282575">
-                          <a:solidFill>
-                            <a:srgbClr val="7E2100"/>
-                          </a:solidFill>
-                        </a:ln>
-                      </wps:spPr>
-                      <wps:style>
-                        <a:lnRef idx="2">
-                          <a:schemeClr val="accent1">
-                            <a:shade val="50000"/>
-                          </a:schemeClr>
-                        </a:lnRef>
-                        <a:fillRef idx="1">
-                          <a:schemeClr val="accent1"/>
-                        </a:fillRef>
-                        <a:effectRef idx="0">
-                          <a:schemeClr val="accent1"/>
-                        </a:effectRef>
-                        <a:fontRef idx="minor">
-                          <a:schemeClr val="lt1"/>
-                        </a:fontRef>
-                      </wps:style>
-                      <wps:bodyPr rot="0" spcFirstLastPara="0" vertOverflow="overflow" horzOverflow="overflow" vert="horz" wrap="square" lIns="91440" tIns="45720" rIns="91440" bIns="45720" numCol="1" spcCol="0" rtlCol="0" fromWordArt="0" anchor="ctr" anchorCtr="0" forceAA="0" compatLnSpc="1">
-                        <a:prstTxWarp prst="textNoShape">
-                          <a:avLst/>
-                        </a:prstTxWarp>
-                        <a:noAutofit/>
-                      </wps:bodyPr>
-                    </wps:wsp>
-                  </a:graphicData>
-                </a:graphic>
-                <wp14:sizeRelH relativeFrom="margin">
-                  <wp14:pctWidth>0</wp14:pctWidth>
-                </wp14:sizeRelH>
-                <wp14:sizeRelV relativeFrom="margin">
-                  <wp14:pctHeight>0</wp14:pctHeight>
-                </wp14:sizeRelV>
-              </wp:anchor>
-            </w:drawing>
-          </mc:Choice>
-          <mc:Fallback>
-            <w:pict>
-              <v:rect w14:anchorId="63E0508A" id="Rectangle 13" o:spid="_x0000_s1026" style="position:absolute;margin-left:-66.5pt;margin-top:-.65pt;width:400.2pt;height:252.85pt;z-index:251686912;visibility:visible;mso-wrap-style:square;mso-width-percent:0;mso-height-percent:0;mso-wrap-distance-left:9pt;mso-wrap-distance-top:0;mso-wrap-distance-right:9pt;mso-wrap-distance-bottom:0;mso-position-horizontal:absolute;mso-position-horizontal-relative:text;mso-position-vertical:absolute;mso-position-vertical-relative:text;mso-width-percent:0;mso-height-percent:0;mso-width-relative:margin;mso-height-relative:margin;v-text-anchor:middle" o:gfxdata="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" filled="f" strokecolor="#7e2100" strokeweight="22.25pt"/>
-            </w:pict>
-          </mc:Fallback>
-        </mc:AlternateContent>
-      </w:r>
-      <w:r>
-        <w:rPr>
-          <w:noProof/>
-        </w:rPr>
-        <mc:AlternateContent>
-          <mc:Choice Requires="wps">
-            <w:drawing>
-              <wp:anchor distT="0" distB="0" distL="114300" distR="114300" simplePos="0" relativeHeight="251658239" behindDoc="1" locked="0" layoutInCell="1" allowOverlap="1" wp14:anchorId="22642668" wp14:editId="1C2454BA">
-                <wp:simplePos x="0" y="0"/>
-                <wp:positionH relativeFrom="page">
-                  <wp:posOffset>-103367</wp:posOffset>
-                </wp:positionH>
-                <wp:positionV relativeFrom="paragraph">
-                  <wp:posOffset>-118745</wp:posOffset>
-                </wp:positionV>
-                <wp:extent cx="10797540" cy="4412339"/>
-                <wp:effectExtent l="0" t="0" r="22860" b="26670"/>
-                <wp:wrapNone/>
-                <wp:docPr id="2" name="Rectangle 2"/>
-                <wp:cNvGraphicFramePr/>
-                <a:graphic xmlns:a="http://schemas.openxmlformats.org/drawingml/2006/main">
-                  <a:graphicData uri="http://schemas.microsoft.com/office/word/2010/wordprocessingShape">
-                    <wps:wsp>
-                      <wps:cNvSpPr/>
-                      <wps:spPr>
-                        <a:xfrm>
-                          <a:off x="0" y="0"/>
-                          <a:ext cx="10797540" cy="4412339"/>
-                        </a:xfrm>
-                        <a:prstGeom prst="rect">
-                          <a:avLst/>
-                        </a:prstGeom>
-                        <a:solidFill>
-                          <a:srgbClr val="8A0000"/>
-                        </a:solidFill>
-                      </wps:spPr>
-                      <wps:style>
-                        <a:lnRef idx="2">
-                          <a:schemeClr val="accent1">
-                            <a:shade val="50000"/>
-                          </a:schemeClr>
-                        </a:lnRef>
-                        <a:fillRef idx="1">
-                          <a:schemeClr val="accent1"/>
-                        </a:fillRef>
-                        <a:effectRef idx="0">
-                          <a:schemeClr val="accent1"/>
-                        </a:effectRef>
-                        <a:fontRef idx="minor">
-                          <a:schemeClr val="lt1"/>
-                        </a:fontRef>
-                      </wps:style>
-                      <wps:bodyPr rot="0" spcFirstLastPara="0" vertOverflow="overflow" horzOverflow="overflow" vert="horz" wrap="square" lIns="91440" tIns="45720" rIns="91440" bIns="45720" numCol="1" spcCol="0" rtlCol="0" fromWordArt="0" anchor="ctr" anchorCtr="0" forceAA="0" compatLnSpc="1">
-                        <a:prstTxWarp prst="textNoShape">
-                          <a:avLst/>
-                        </a:prstTxWarp>
-                        <a:noAutofit/>
-                      </wps:bodyPr>
-                    </wps:wsp>
-                  </a:graphicData>
-                </a:graphic>
-                <wp14:sizeRelH relativeFrom="margin">
-                  <wp14:pctWidth>0</wp14:pctWidth>
-                </wp14:sizeRelH>
-                <wp14:sizeRelV relativeFrom="margin">
-                  <wp14:pctHeight>0</wp14:pctHeight>
-                </wp14:sizeRelV>
-              </wp:anchor>
-            </w:drawing>
-          </mc:Choice>
-          <mc:Fallback>
-            <w:pict>
-              <v:rect w14:anchorId="6AE21255" id="Rectangle 2" o:spid="_x0000_s1026" style="position:absolute;margin-left:-8.15pt;margin-top:-9.35pt;width:850.2pt;height:347.45pt;z-index:-251658241;visibility:visible;mso-wrap-style:square;mso-width-percent:0;mso-height-percent:0;mso-wrap-distance-left:9pt;mso-wrap-distance-top:0;mso-wrap-distance-right:9pt;mso-wrap-distance-bottom:0;mso-position-horizontal:absolute;mso-position-horizontal-relative:page;mso-position-vertical:absolute;mso-position-vertical-relative:text;mso-width-percent:0;mso-height-percent:0;mso-width-relative:margin;mso-height-relative:margin;v-text-anchor:middle" o:gfxdata="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" fillcolor="#8a0000" strokecolor="#1f3763 [1604]" strokeweight="1pt">
-                <w10:wrap anchorx="page"/>
-              </v:rect>
-            </w:pict>
-          </mc:Fallback>
-        </mc:AlternateContent>
-      </w:r>
-      <w:r>
-        <w:rPr>
-          <w:noProof/>
-        </w:rPr>
         <w:drawing>
-          <wp:anchor distT="0" distB="0" distL="114300" distR="114300" simplePos="0" relativeHeight="251657214" behindDoc="0" locked="0" layoutInCell="1" allowOverlap="1" wp14:anchorId="3544CD66" wp14:editId="36C75A25">
+          <wp:anchor distT="0" distB="0" distL="114300" distR="114300" simplePos="0" relativeHeight="251686912" behindDoc="1" locked="0" layoutInCell="1" allowOverlap="1" wp14:anchorId="6B10CEC0" wp14:editId="36488EB3">
             <wp:simplePos x="0" y="0"/>
-            <wp:positionH relativeFrom="column">
-              <wp:posOffset>4602149</wp:posOffset>
+            <wp:positionH relativeFrom="page">
+              <wp:posOffset>88900</wp:posOffset>
             </wp:positionH>
             <wp:positionV relativeFrom="paragraph">
-              <wp:posOffset>0</wp:posOffset>
+              <wp:posOffset>-4445</wp:posOffset>
             </wp:positionV>
-            <wp:extent cx="5085080" cy="3204210"/>
-            <wp:effectExtent l="0" t="0" r="1270" b="0"/>
-            <wp:wrapTopAndBottom/>
+            <wp:extent cx="10452100" cy="3196447"/>
+            <wp:effectExtent l="0" t="0" r="6350" b="4445"/>
+            <wp:wrapNone/>
             <wp:docPr id="10" name="Picture 10"/>
             <wp:cNvGraphicFramePr>
               <a:graphicFrameLocks xmlns:a="http://schemas.openxmlformats.org/drawingml/2006/main" noChangeAspect="1"/>
@@ -279,80 +38,13 @@
                         </a:ext>
                       </a:extLst>
                     </a:blip>
-                    <a:srcRect l="51825"/>
+                    <a:srcRect r="736"/>
                     <a:stretch/>
                   </pic:blipFill>
                   <pic:spPr bwMode="auto">
                     <a:xfrm>
                       <a:off x="0" y="0"/>
-                      <a:ext cx="5085080" cy="3204210"/>
-                    </a:xfrm>
-                    <a:prstGeom prst="rect">
-                      <a:avLst/>
-                    </a:prstGeom>
-                    <a:ln>
-                      <a:noFill/>
-                    </a:ln>
-                    <a:extLst>
-                      <a:ext uri="{53640926-AAD7-44D8-BBD7-CCE9431645EC}">
-                        <a14:shadowObscured xmlns:a14="http://schemas.microsoft.com/office/drawing/2010/main"/>
-                      </a:ext>
-                    </a:extLst>
-                  </pic:spPr>
-                </pic:pic>
-              </a:graphicData>
-            </a:graphic>
-            <wp14:sizeRelH relativeFrom="margin">
-              <wp14:pctWidth>0</wp14:pctWidth>
-            </wp14:sizeRelH>
-            <wp14:sizeRelV relativeFrom="margin">
-              <wp14:pctHeight>0</wp14:pctHeight>
-            </wp14:sizeRelV>
-          </wp:anchor>
-        </w:drawing>
-      </w:r>
-      <w:r>
-        <w:rPr>
-          <w:noProof/>
-        </w:rPr>
-        <w:drawing>
-          <wp:anchor distT="0" distB="0" distL="114300" distR="114300" simplePos="0" relativeHeight="251656189" behindDoc="0" locked="0" layoutInCell="1" allowOverlap="1" wp14:anchorId="37F37BBA" wp14:editId="3287DFD2">
-            <wp:simplePos x="0" y="0"/>
-            <wp:positionH relativeFrom="column">
-              <wp:posOffset>-838200</wp:posOffset>
-            </wp:positionH>
-            <wp:positionV relativeFrom="paragraph">
-              <wp:posOffset>304</wp:posOffset>
-            </wp:positionV>
-            <wp:extent cx="5088255" cy="3204210"/>
-            <wp:effectExtent l="0" t="0" r="0" b="0"/>
-            <wp:wrapTopAndBottom/>
-            <wp:docPr id="12" name="Picture 12"/>
-            <wp:cNvGraphicFramePr>
-              <a:graphicFrameLocks xmlns:a="http://schemas.openxmlformats.org/drawingml/2006/main" noChangeAspect="1"/>
-            </wp:cNvGraphicFramePr>
-            <a:graphic xmlns:a="http://schemas.openxmlformats.org/drawingml/2006/main">
-              <a:graphicData uri="http://schemas.openxmlformats.org/drawingml/2006/picture">
-                <pic:pic xmlns:pic="http://schemas.openxmlformats.org/drawingml/2006/picture">
-                  <pic:nvPicPr>
-                    <pic:cNvPr id="10" name="Picture 10"/>
-                    <pic:cNvPicPr/>
-                  </pic:nvPicPr>
-                  <pic:blipFill rotWithShape="1">
-                    <a:blip r:embed="rId4" cstate="print">
-                      <a:extLst>
-                        <a:ext uri="{28A0092B-C50C-407E-A947-70E740481C1C}">
-                          <a14:useLocalDpi xmlns:a14="http://schemas.microsoft.com/office/drawing/2010/main" val="0"/>
-                        </a:ext>
-                      </a:extLst>
-                    </a:blip>
-                    <a:srcRect r="51790"/>
-                    <a:stretch/>
-                  </pic:blipFill>
-                  <pic:spPr bwMode="auto">
-                    <a:xfrm>
-                      <a:off x="0" y="0"/>
-                      <a:ext cx="5088255" cy="3204210"/>
+                      <a:ext cx="10452569" cy="3196590"/>
                     </a:xfrm>
                     <a:prstGeom prst="rect">
                       <a:avLst/>
@@ -1889,7 +1581,7 @@
         <mc:AlternateContent>
           <mc:Choice Requires="wps">
             <w:drawing>
-              <wp:anchor distT="45720" distB="45720" distL="114300" distR="114300" simplePos="0" relativeHeight="251663360" behindDoc="0" locked="0" layoutInCell="1" allowOverlap="1" wp14:anchorId="3A561120" wp14:editId="09B30A0F">
+              <wp:anchor distT="45720" distB="45720" distL="114300" distR="114300" simplePos="0" relativeHeight="251663360" behindDoc="0" locked="0" layoutInCell="1" allowOverlap="1" wp14:anchorId="3A561120" wp14:editId="526D14C2">
                 <wp:simplePos x="0" y="0"/>
                 <wp:positionH relativeFrom="column">
                   <wp:posOffset>-457200</wp:posOffset>
@@ -2032,6 +1724,85 @@
                 </v:textbox>
                 <w10:wrap type="square"/>
               </v:shape>
+            </w:pict>
+          </mc:Fallback>
+        </mc:AlternateContent>
+      </w:r>
+      <w:r>
+        <w:rPr>
+          <w:noProof/>
+        </w:rPr>
+        <mc:AlternateContent>
+          <mc:Choice Requires="wps">
+            <w:drawing>
+              <wp:anchor distT="0" distB="0" distL="114300" distR="114300" simplePos="0" relativeHeight="251658239" behindDoc="1" locked="0" layoutInCell="1" allowOverlap="1" wp14:anchorId="22642668" wp14:editId="75E7B22F">
+                <wp:simplePos x="0" y="0"/>
+                <wp:positionH relativeFrom="page">
+                  <wp:align>right</wp:align>
+                </wp:positionH>
+                <wp:positionV relativeFrom="paragraph">
+                  <wp:posOffset>-869674</wp:posOffset>
+                </wp:positionV>
+                <wp:extent cx="10654748" cy="4389120"/>
+                <wp:effectExtent l="0" t="0" r="13335" b="11430"/>
+                <wp:wrapNone/>
+                <wp:docPr id="2" name="Rectangle 2"/>
+                <wp:cNvGraphicFramePr/>
+                <a:graphic xmlns:a="http://schemas.openxmlformats.org/drawingml/2006/main">
+                  <a:graphicData uri="http://schemas.microsoft.com/office/word/2010/wordprocessingShape">
+                    <wps:wsp>
+                      <wps:cNvSpPr/>
+                      <wps:spPr>
+                        <a:xfrm>
+                          <a:off x="0" y="0"/>
+                          <a:ext cx="10654748" cy="4389120"/>
+                        </a:xfrm>
+                        <a:prstGeom prst="rect">
+                          <a:avLst/>
+                        </a:prstGeom>
+                        <a:solidFill>
+                          <a:srgbClr val="82291D"/>
+                        </a:solidFill>
+                      </wps:spPr>
+                      <wps:style>
+                        <a:lnRef idx="2">
+                          <a:schemeClr val="accent1">
+                            <a:shade val="50000"/>
+                          </a:schemeClr>
+                        </a:lnRef>
+                        <a:fillRef idx="1">
+                          <a:schemeClr val="accent1"/>
+                        </a:fillRef>
+                        <a:effectRef idx="0">
+                          <a:schemeClr val="accent1"/>
+                        </a:effectRef>
+                        <a:fontRef idx="minor">
+                          <a:schemeClr val="lt1"/>
+                        </a:fontRef>
+                      </wps:style>
+                      <wps:bodyPr rot="0" spcFirstLastPara="0" vertOverflow="overflow" horzOverflow="overflow" vert="horz" wrap="square" lIns="91440" tIns="45720" rIns="91440" bIns="45720" numCol="1" spcCol="0" rtlCol="0" fromWordArt="0" anchor="ctr" anchorCtr="0" forceAA="0" compatLnSpc="1">
+                        <a:prstTxWarp prst="textNoShape">
+                          <a:avLst/>
+                        </a:prstTxWarp>
+                        <a:noAutofit/>
+                      </wps:bodyPr>
+                    </wps:wsp>
+                  </a:graphicData>
+                </a:graphic>
+                <wp14:sizeRelH relativeFrom="margin">
+                  <wp14:pctWidth>0</wp14:pctWidth>
+                </wp14:sizeRelH>
+                <wp14:sizeRelV relativeFrom="margin">
+                  <wp14:pctHeight>0</wp14:pctHeight>
+                </wp14:sizeRelV>
+              </wp:anchor>
+            </w:drawing>
+          </mc:Choice>
+          <mc:Fallback>
+            <w:pict>
+              <v:rect w14:anchorId="36859DB2" id="Rectangle 2" o:spid="_x0000_s1026" style="position:absolute;margin-left:787.75pt;margin-top:-68.5pt;width:838.95pt;height:345.6pt;z-index:-251658241;visibility:visible;mso-wrap-style:square;mso-width-percent:0;mso-height-percent:0;mso-wrap-distance-left:9pt;mso-wrap-distance-top:0;mso-wrap-distance-right:9pt;mso-wrap-distance-bottom:0;mso-position-horizontal:right;mso-position-horizontal-relative:page;mso-position-vertical:absolute;mso-position-vertical-relative:text;mso-width-percent:0;mso-height-percent:0;mso-width-relative:margin;mso-height-relative:margin;v-text-anchor:middle" o:gfxdata="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" fillcolor="#82291d" strokecolor="#1f3763 [1604]" strokeweight="1pt">
+                <w10:wrap anchorx="page"/>
+              </v:rect>
             </w:pict>
           </mc:Fallback>
         </mc:AlternateContent>

</xml_diff>

<commit_message>
Fix memory leaks, add Drive retry/backoff, update templates
- docxQueue: clear photoBuf after DOCX generation (memory)
- uploadQueue: only persist IDs to disk, clear buffers after each attempt (memory)
- idCardGenerator: null templateBuf after PizZip load (peak memory)
- googleDrive: add retryWithBackoff for 429/403/5xx (1s/3s/9s), throttle deleteFolderContents
- googleDrive: fix generateSectionExcel race condition (cleanup duplicate Excels)
- idCardGenerator: all templates now use rId5 for photo (was rId4 for templates 1&4)
- idCardGenerator: remove unused placeholders (SECTION, STRAND, TIMESTAMP) and dead code
- idCardGenerator: fix birthday extra }} template artifact
- Replace all templates (idtemp1-4.docx from Desktop)
- Remove dead hasPdf field from server.js status endpoint
</commit_message>
<xml_diff>
--- a/templates/idtemp2.docx
+++ b/templates/idtemp2.docx
@@ -1,6 +1,7 @@
 
 <file path=word/document.xml><?xml version="1.0" encoding="utf-8"?>
 <w:document xmlns:wpc="http://schemas.microsoft.com/office/word/2010/wordprocessingCanvas" xmlns:cx="http://schemas.microsoft.com/office/drawing/2014/chartex" xmlns:cx1="http://schemas.microsoft.com/office/drawing/2015/9/8/chartex" xmlns:cx2="http://schemas.microsoft.com/office/drawing/2015/10/21/chartex" xmlns:cx3="http://schemas.microsoft.com/office/drawing/2016/5/9/chartex" xmlns:cx4="http://schemas.microsoft.com/office/drawing/2016/5/10/chartex" xmlns:cx5="http://schemas.microsoft.com/office/drawing/2016/5/11/chartex" xmlns:cx6="http://schemas.microsoft.com/office/drawing/2016/5/12/chartex" xmlns:cx7="http://schemas.microsoft.com/office/drawing/2016/5/13/chartex" xmlns:cx8="http://schemas.microsoft.com/office/drawing/2016/5/14/chartex" xmlns:mc="http://schemas.openxmlformats.org/markup-compatibility/2006" xmlns:aink="http://schemas.microsoft.com/office/drawing/2016/ink" xmlns:am3d="http://schemas.microsoft.com/office/drawing/2017/model3d" xmlns:o="urn:schemas-microsoft-com:office:office" xmlns:r="http://schemas.openxmlformats.org/officeDocument/2006/relationships" xmlns:m="http://schemas.openxmlformats.org/officeDocument/2006/math" xmlns:v="urn:schemas-microsoft-com:vml" xmlns:wp14="http://schemas.microsoft.com/office/word/2010/wordprocessingDrawing" xmlns:wp="http://schemas.openxmlformats.org/drawingml/2006/wordprocessingDrawing" xmlns:w10="urn:schemas-microsoft-com:office:word" xmlns:w="http://schemas.openxmlformats.org/wordprocessingml/2006/main" xmlns:w14="http://schemas.microsoft.com/office/word/2010/wordml" xmlns:w15="http://schemas.microsoft.com/office/word/2012/wordml" xmlns:w16cex="http://schemas.microsoft.com/office/word/2018/wordml/cex" xmlns:w16cid="http://schemas.microsoft.com/office/word/2016/wordml/cid" xmlns:w16="http://schemas.microsoft.com/office/word/2018/wordml" xmlns:w16sdtdh="http://schemas.microsoft.com/office/word/2020/wordml/sdtdatahash" xmlns:w16se="http://schemas.microsoft.com/office/word/2015/wordml/symex" xmlns:wpg="http://schemas.microsoft.com/office/word/2010/wordprocessingGroup" xmlns:wpi="http://schemas.microsoft.com/office/word/2010/wordprocessingInk" xmlns:wne="http://schemas.microsoft.com/office/word/2006/wordml" xmlns:wps="http://schemas.microsoft.com/office/word/2010/wordprocessingShape" mc:Ignorable="w14 w15 w16se w16cid w16 w16cex w16sdtdh wp14">
+  <w:background w:color="ED0000"/>
   <w:body>
     <w:p>
       <w:r>
@@ -8,18 +9,18 @@
           <w:noProof/>
         </w:rPr>
         <w:drawing>
-          <wp:anchor distT="0" distB="0" distL="114300" distR="114300" simplePos="0" relativeHeight="251686912" behindDoc="1" locked="0" layoutInCell="1" allowOverlap="1" wp14:anchorId="6B10CEC0" wp14:editId="36488EB3">
+          <wp:anchor distT="0" distB="0" distL="114300" distR="114300" simplePos="0" relativeHeight="251660287" behindDoc="0" locked="0" layoutInCell="1" allowOverlap="1" wp14:anchorId="30EB85A4" wp14:editId="78B5ABB1">
             <wp:simplePos x="0" y="0"/>
             <wp:positionH relativeFrom="page">
-              <wp:posOffset>88900</wp:posOffset>
+              <wp:posOffset>41275</wp:posOffset>
             </wp:positionH>
             <wp:positionV relativeFrom="paragraph">
-              <wp:posOffset>-4445</wp:posOffset>
+              <wp:posOffset>0</wp:posOffset>
             </wp:positionV>
-            <wp:extent cx="10452100" cy="3196447"/>
-            <wp:effectExtent l="0" t="0" r="6350" b="4445"/>
-            <wp:wrapNone/>
-            <wp:docPr id="10" name="Picture 10"/>
+            <wp:extent cx="10602595" cy="3217545"/>
+            <wp:effectExtent l="0" t="0" r="8255" b="1905"/>
+            <wp:wrapTopAndBottom/>
+            <wp:docPr id="12" name="Picture 12"/>
             <wp:cNvGraphicFramePr>
               <a:graphicFrameLocks xmlns:a="http://schemas.openxmlformats.org/drawingml/2006/main" noChangeAspect="1"/>
             </wp:cNvGraphicFramePr>
@@ -27,10 +28,10 @@
               <a:graphicData uri="http://schemas.openxmlformats.org/drawingml/2006/picture">
                 <pic:pic xmlns:pic="http://schemas.openxmlformats.org/drawingml/2006/picture">
                   <pic:nvPicPr>
-                    <pic:cNvPr id="10" name="Picture 10"/>
+                    <pic:cNvPr id="12" name="Picture 12"/>
                     <pic:cNvPicPr/>
                   </pic:nvPicPr>
-                  <pic:blipFill rotWithShape="1">
+                  <pic:blipFill>
                     <a:blip r:embed="rId4" cstate="print">
                       <a:extLst>
                         <a:ext uri="{28A0092B-C50C-407E-A947-70E740481C1C}">
@@ -38,25 +39,18 @@
                         </a:ext>
                       </a:extLst>
                     </a:blip>
-                    <a:srcRect r="736"/>
-                    <a:stretch/>
+                    <a:stretch>
+                      <a:fillRect/>
+                    </a:stretch>
                   </pic:blipFill>
-                  <pic:spPr bwMode="auto">
+                  <pic:spPr>
                     <a:xfrm>
                       <a:off x="0" y="0"/>
-                      <a:ext cx="10452569" cy="3196590"/>
+                      <a:ext cx="10602595" cy="3217545"/>
                     </a:xfrm>
                     <a:prstGeom prst="rect">
                       <a:avLst/>
                     </a:prstGeom>
-                    <a:ln>
-                      <a:noFill/>
-                    </a:ln>
-                    <a:extLst>
-                      <a:ext uri="{53640926-AAD7-44D8-BBD7-CCE9431645EC}">
-                        <a14:shadowObscured xmlns:a14="http://schemas.microsoft.com/office/drawing/2010/main"/>
-                      </a:ext>
-                    </a:extLst>
                   </pic:spPr>
                 </pic:pic>
               </a:graphicData>
@@ -75,13 +69,13 @@
           <w:noProof/>
         </w:rPr>
         <w:drawing>
-          <wp:anchor distT="0" distB="0" distL="114300" distR="114300" simplePos="0" relativeHeight="251685888" behindDoc="0" locked="0" layoutInCell="1" allowOverlap="1" wp14:anchorId="0E78DF1C" wp14:editId="70BEEBFD">
+          <wp:anchor distT="0" distB="0" distL="114300" distR="114300" simplePos="0" relativeHeight="251685888" behindDoc="0" locked="0" layoutInCell="1" allowOverlap="1" wp14:anchorId="0E78DF1C" wp14:editId="00D7913C">
             <wp:simplePos x="0" y="0"/>
             <wp:positionH relativeFrom="column">
-              <wp:posOffset>-355600</wp:posOffset>
+              <wp:posOffset>-309880</wp:posOffset>
             </wp:positionH>
             <wp:positionV relativeFrom="paragraph">
-              <wp:posOffset>342900</wp:posOffset>
+              <wp:posOffset>380696</wp:posOffset>
             </wp:positionV>
             <wp:extent cx="1619250" cy="1612900"/>
             <wp:effectExtent l="0" t="0" r="0" b="6350"/>
@@ -131,7 +125,7 @@
         <mc:AlternateContent>
           <mc:Choice Requires="wps">
             <w:drawing>
-              <wp:anchor distT="45720" distB="45720" distL="114300" distR="114300" simplePos="0" relativeHeight="251661312" behindDoc="0" locked="0" layoutInCell="1" allowOverlap="1" wp14:anchorId="32344B30" wp14:editId="55807C31">
+              <wp:anchor distT="45720" distB="45720" distL="114300" distR="114300" simplePos="0" relativeHeight="251661312" behindDoc="0" locked="0" layoutInCell="1" allowOverlap="1" wp14:anchorId="32344B30" wp14:editId="457C862F">
                 <wp:simplePos x="0" y="0"/>
                 <wp:positionH relativeFrom="column">
                   <wp:posOffset>-476250</wp:posOffset>
@@ -371,119 +365,7 @@
         <mc:AlternateContent>
           <mc:Choice Requires="wps">
             <w:drawing>
-              <wp:anchor distT="45720" distB="45720" distL="114300" distR="114300" simplePos="0" relativeHeight="251683840" behindDoc="0" locked="0" layoutInCell="1" allowOverlap="1" wp14:anchorId="69B45CCF" wp14:editId="480DABEB">
-                <wp:simplePos x="0" y="0"/>
-                <wp:positionH relativeFrom="column">
-                  <wp:posOffset>6403340</wp:posOffset>
-                </wp:positionH>
-                <wp:positionV relativeFrom="paragraph">
-                  <wp:posOffset>1474470</wp:posOffset>
-                </wp:positionV>
-                <wp:extent cx="1363980" cy="102235"/>
-                <wp:effectExtent l="0" t="0" r="7620" b="12065"/>
-                <wp:wrapSquare wrapText="bothSides"/>
-                <wp:docPr id="1" name="Text Box 2"/>
-                <wp:cNvGraphicFramePr>
-                  <a:graphicFrameLocks xmlns:a="http://schemas.openxmlformats.org/drawingml/2006/main"/>
-                </wp:cNvGraphicFramePr>
-                <a:graphic xmlns:a="http://schemas.openxmlformats.org/drawingml/2006/main">
-                  <a:graphicData uri="http://schemas.microsoft.com/office/word/2010/wordprocessingShape">
-                    <wps:wsp>
-                      <wps:cNvSpPr txBox="1">
-                        <a:spLocks noChangeArrowheads="1"/>
-                      </wps:cNvSpPr>
-                      <wps:spPr bwMode="auto">
-                        <a:xfrm>
-                          <a:off x="0" y="0"/>
-                          <a:ext cx="1363980" cy="102235"/>
-                        </a:xfrm>
-                        <a:prstGeom prst="rect">
-                          <a:avLst/>
-                        </a:prstGeom>
-                        <a:noFill/>
-                        <a:ln w="9525">
-                          <a:noFill/>
-                          <a:miter lim="800000"/>
-                          <a:headEnd/>
-                          <a:tailEnd/>
-                        </a:ln>
-                      </wps:spPr>
-                      <wps:txbx>
-                        <w:txbxContent>
-                          <w:p>
-                            <w:pPr>
-                              <w:jc w:val="center"/>
-                              <w:rPr>
-                                <w:spacing w:val="-4"/>
-                                <w:sz w:val="10"/>
-                                <w:szCs w:val="10"/>
-                              </w:rPr>
-                            </w:pPr>
-                            <w:r>
-                              <w:rPr>
-                                <w:spacing w:val="-4"/>
-                                <w:sz w:val="10"/>
-                                <w:szCs w:val="10"/>
-                              </w:rPr>
-                              <w:t>PLEASE CONTACT</w:t>
-                            </w:r>
-                          </w:p>
-                        </w:txbxContent>
-                      </wps:txbx>
-                      <wps:bodyPr rot="0" vert="horz" wrap="square" lIns="0" tIns="0" rIns="0" bIns="0" anchor="t" anchorCtr="0">
-                        <a:noAutofit/>
-                      </wps:bodyPr>
-                    </wps:wsp>
-                  </a:graphicData>
-                </a:graphic>
-                <wp14:sizeRelH relativeFrom="margin">
-                  <wp14:pctWidth>0</wp14:pctWidth>
-                </wp14:sizeRelH>
-                <wp14:sizeRelV relativeFrom="margin">
-                  <wp14:pctHeight>0</wp14:pctHeight>
-                </wp14:sizeRelV>
-              </wp:anchor>
-            </w:drawing>
-          </mc:Choice>
-          <mc:Fallback>
-            <w:pict>
-              <v:shape w14:anchorId="69B45CCF" id="_x0000_s1028" type="#_x0000_t202" style="position:absolute;margin-left:504.2pt;margin-top:116.1pt;width:107.4pt;height:8.05pt;z-index:251683840;visibility:visible;mso-wrap-style:square;mso-width-percent:0;mso-height-percent:0;mso-wrap-distance-left:9pt;mso-wrap-distance-top:3.6pt;mso-wrap-distance-right:9pt;mso-wrap-distance-bottom:3.6pt;mso-position-horizontal:absolute;mso-position-horizontal-relative:text;mso-position-vertical:absolute;mso-position-vertical-relative:text;mso-width-percent:0;mso-height-percent:0;mso-width-relative:margin;mso-height-relative:margin;v-text-anchor:top" o:gfxdata="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" filled="f" stroked="f">
-                <v:textbox inset="0,0,0,0">
-                  <w:txbxContent>
-                    <w:p>
-                      <w:pPr>
-                        <w:jc w:val="center"/>
-                        <w:rPr>
-                          <w:spacing w:val="-4"/>
-                          <w:sz w:val="10"/>
-                          <w:szCs w:val="10"/>
-                        </w:rPr>
-                      </w:pPr>
-                      <w:r>
-                        <w:rPr>
-                          <w:spacing w:val="-4"/>
-                          <w:sz w:val="10"/>
-                          <w:szCs w:val="10"/>
-                        </w:rPr>
-                        <w:t>PLEASE CONTACT</w:t>
-                      </w:r>
-                    </w:p>
-                  </w:txbxContent>
-                </v:textbox>
-                <w10:wrap type="square"/>
-              </v:shape>
-            </w:pict>
-          </mc:Fallback>
-        </mc:AlternateContent>
-      </w:r>
-      <w:r>
-        <w:rPr>
-          <w:noProof/>
-        </w:rPr>
-        <mc:AlternateContent>
-          <mc:Choice Requires="wps">
-            <w:drawing>
-              <wp:anchor distT="45720" distB="45720" distL="114300" distR="114300" simplePos="0" relativeHeight="251675648" behindDoc="0" locked="0" layoutInCell="1" allowOverlap="1" wp14:anchorId="5DDDD3EE" wp14:editId="5ABB40AE">
+              <wp:anchor distT="45720" distB="45720" distL="114300" distR="114300" simplePos="0" relativeHeight="251675648" behindDoc="0" locked="0" layoutInCell="1" allowOverlap="1" wp14:anchorId="5DDDD3EE" wp14:editId="370E41BD">
                 <wp:simplePos x="0" y="0"/>
                 <wp:positionH relativeFrom="column">
                   <wp:posOffset>5060950</wp:posOffset>
@@ -577,7 +459,7 @@
           </mc:Choice>
           <mc:Fallback>
             <w:pict>
-              <v:shape w14:anchorId="5DDDD3EE" id="_x0000_s1029" type="#_x0000_t202" style="position:absolute;margin-left:398.5pt;margin-top:135.65pt;width:320.35pt;height:12pt;z-index:251675648;visibility:visible;mso-wrap-style:square;mso-width-percent:0;mso-height-percent:0;mso-wrap-distance-left:9pt;mso-wrap-distance-top:3.6pt;mso-wrap-distance-right:9pt;mso-wrap-distance-bottom:3.6pt;mso-position-horizontal:absolute;mso-position-horizontal-relative:text;mso-position-vertical:absolute;mso-position-vertical-relative:text;mso-width-percent:0;mso-height-percent:0;mso-width-relative:margin;mso-height-relative:margin;v-text-anchor:top" o:gfxdata="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" filled="f" stroked="f">
+              <v:shape w14:anchorId="5DDDD3EE" id="_x0000_s1028" type="#_x0000_t202" style="position:absolute;margin-left:398.5pt;margin-top:135.65pt;width:320.35pt;height:12pt;z-index:251675648;visibility:visible;mso-wrap-style:square;mso-width-percent:0;mso-height-percent:0;mso-wrap-distance-left:9pt;mso-wrap-distance-top:3.6pt;mso-wrap-distance-right:9pt;mso-wrap-distance-bottom:3.6pt;mso-position-horizontal:absolute;mso-position-horizontal-relative:text;mso-position-vertical:absolute;mso-position-vertical-relative:text;mso-width-percent:0;mso-height-percent:0;mso-width-relative:margin;mso-height-relative:margin;v-text-anchor:top" o:gfxdata="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" filled="f" stroked="f">
                 <v:textbox inset="0,0,0,0">
                   <w:txbxContent>
                     <w:p>
@@ -928,7 +810,7 @@
                                     </pic:cNvPicPr>
                                   </pic:nvPicPr>
                                   <pic:blipFill>
-                                    <a:blip r:embed="rId6">
+                                    <a:blip r:embed="rId7">
                                       <a:extLst>
                                         <a:ext uri="{28A0092B-C50C-407E-A947-70E740481C1C}">
                                           <a14:useLocalDpi xmlns:a14="http://schemas.microsoft.com/office/drawing/2010/main" val="0"/>
@@ -1581,7 +1463,7 @@
         <mc:AlternateContent>
           <mc:Choice Requires="wps">
             <w:drawing>
-              <wp:anchor distT="45720" distB="45720" distL="114300" distR="114300" simplePos="0" relativeHeight="251663360" behindDoc="0" locked="0" layoutInCell="1" allowOverlap="1" wp14:anchorId="3A561120" wp14:editId="526D14C2">
+              <wp:anchor distT="45720" distB="45720" distL="114300" distR="114300" simplePos="0" relativeHeight="251663360" behindDoc="0" locked="0" layoutInCell="1" allowOverlap="1" wp14:anchorId="3A561120" wp14:editId="09B30A0F">
                 <wp:simplePos x="0" y="0"/>
                 <wp:positionH relativeFrom="column">
                   <wp:posOffset>-457200</wp:posOffset>
@@ -1724,85 +1606,6 @@
                 </v:textbox>
                 <w10:wrap type="square"/>
               </v:shape>
-            </w:pict>
-          </mc:Fallback>
-        </mc:AlternateContent>
-      </w:r>
-      <w:r>
-        <w:rPr>
-          <w:noProof/>
-        </w:rPr>
-        <mc:AlternateContent>
-          <mc:Choice Requires="wps">
-            <w:drawing>
-              <wp:anchor distT="0" distB="0" distL="114300" distR="114300" simplePos="0" relativeHeight="251658239" behindDoc="1" locked="0" layoutInCell="1" allowOverlap="1" wp14:anchorId="22642668" wp14:editId="75E7B22F">
-                <wp:simplePos x="0" y="0"/>
-                <wp:positionH relativeFrom="page">
-                  <wp:align>right</wp:align>
-                </wp:positionH>
-                <wp:positionV relativeFrom="paragraph">
-                  <wp:posOffset>-869674</wp:posOffset>
-                </wp:positionV>
-                <wp:extent cx="10654748" cy="4389120"/>
-                <wp:effectExtent l="0" t="0" r="13335" b="11430"/>
-                <wp:wrapNone/>
-                <wp:docPr id="2" name="Rectangle 2"/>
-                <wp:cNvGraphicFramePr/>
-                <a:graphic xmlns:a="http://schemas.openxmlformats.org/drawingml/2006/main">
-                  <a:graphicData uri="http://schemas.microsoft.com/office/word/2010/wordprocessingShape">
-                    <wps:wsp>
-                      <wps:cNvSpPr/>
-                      <wps:spPr>
-                        <a:xfrm>
-                          <a:off x="0" y="0"/>
-                          <a:ext cx="10654748" cy="4389120"/>
-                        </a:xfrm>
-                        <a:prstGeom prst="rect">
-                          <a:avLst/>
-                        </a:prstGeom>
-                        <a:solidFill>
-                          <a:srgbClr val="82291D"/>
-                        </a:solidFill>
-                      </wps:spPr>
-                      <wps:style>
-                        <a:lnRef idx="2">
-                          <a:schemeClr val="accent1">
-                            <a:shade val="50000"/>
-                          </a:schemeClr>
-                        </a:lnRef>
-                        <a:fillRef idx="1">
-                          <a:schemeClr val="accent1"/>
-                        </a:fillRef>
-                        <a:effectRef idx="0">
-                          <a:schemeClr val="accent1"/>
-                        </a:effectRef>
-                        <a:fontRef idx="minor">
-                          <a:schemeClr val="lt1"/>
-                        </a:fontRef>
-                      </wps:style>
-                      <wps:bodyPr rot="0" spcFirstLastPara="0" vertOverflow="overflow" horzOverflow="overflow" vert="horz" wrap="square" lIns="91440" tIns="45720" rIns="91440" bIns="45720" numCol="1" spcCol="0" rtlCol="0" fromWordArt="0" anchor="ctr" anchorCtr="0" forceAA="0" compatLnSpc="1">
-                        <a:prstTxWarp prst="textNoShape">
-                          <a:avLst/>
-                        </a:prstTxWarp>
-                        <a:noAutofit/>
-                      </wps:bodyPr>
-                    </wps:wsp>
-                  </a:graphicData>
-                </a:graphic>
-                <wp14:sizeRelH relativeFrom="margin">
-                  <wp14:pctWidth>0</wp14:pctWidth>
-                </wp14:sizeRelH>
-                <wp14:sizeRelV relativeFrom="margin">
-                  <wp14:pctHeight>0</wp14:pctHeight>
-                </wp14:sizeRelV>
-              </wp:anchor>
-            </w:drawing>
-          </mc:Choice>
-          <mc:Fallback>
-            <w:pict>
-              <v:rect w14:anchorId="36859DB2" id="Rectangle 2" o:spid="_x0000_s1026" style="position:absolute;margin-left:787.75pt;margin-top:-68.5pt;width:838.95pt;height:345.6pt;z-index:-251658241;visibility:visible;mso-wrap-style:square;mso-width-percent:0;mso-height-percent:0;mso-wrap-distance-left:9pt;mso-wrap-distance-top:0;mso-wrap-distance-right:9pt;mso-wrap-distance-bottom:0;mso-position-horizontal:right;mso-position-horizontal-relative:page;mso-position-vertical:absolute;mso-position-vertical-relative:text;mso-width-percent:0;mso-height-percent:0;mso-width-relative:margin;mso-height-relative:margin;v-text-anchor:middle" o:gfxdata="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" fillcolor="#82291d" strokecolor="#1f3763 [1604]" strokeweight="1pt">
-                <w10:wrap anchorx="page"/>
-              </v:rect>
             </w:pict>
           </mc:Fallback>
         </mc:AlternateContent>

</xml_diff>